<commit_message>
Post-audit submission fixes: abstract, citations, docs, assets.
Trim abstract to 230 words, add in-text citations and refs 17–20,
sync README/RELEASE/Zenodo docs, remove internal data_path from split
JSON, and regenerate publication figures and Word export.

Co-authored-by: Cursor <cursoragent@cursor.com>
</commit_message>
<xml_diff>
--- a/vkorc1_integrated_workflow_manuscript.docx
+++ b/vkorc1_integrated_workflow_manuscript.docx
@@ -76,7 +76,7 @@
         <w:t>computational workflow</w:t>
       </w:r>
       <w:r>
-        <w:t xml:space="preserve"> — not an experimentally validated lead-optimization campaign — that combines (i) a multi-task graph attention network (GAT) trained on coagulation and ADMET endpoints under Bemis–Murcko scaffold splitting, (ii) flexible AutoDock Vina docking against human </w:t>
+        <w:t xml:space="preserve"> — not an experimentally validated lead-optimization campaign — combining (i) a multi-task graph attention network (GAT) on coagulation and ADMET endpoints under Bemis–Murcko scaffold splitting, (ii) flexible AutoDock Vina docking against human </w:t>
       </w:r>
       <w:r>
         <w:rPr>
@@ -85,7 +85,7 @@
         <w:t>VKORC1</w:t>
       </w:r>
       <w:r>
-        <w:t xml:space="preserve"> (PDB 6WV3; S-warfarin co-crystal structure) with thermodynamic mapping of binding affinities to pseudo–pXC₅₀ labels, (iii) an active-learning merger that appends reinforcement-learning–generated (RL_Gen) candidates to the training corpus, and (iv) </w:t>
+        <w:t xml:space="preserve"> (PDB 6WV3) with thermodynamic mapping to pseudo–pXC₅₀ labels, (iii) an active-learning merger for RL_Gen candidates, and (iv) </w:t>
       </w:r>
       <w:r>
         <w:rPr>
@@ -94,7 +94,7 @@
         <w:t>REINVENT4</w:t>
       </w:r>
       <w:r>
-        <w:t xml:space="preserve"> staged learning with a custom ExternalProcess GNN scorer. On the held-out scaffold test set, pooled multi-task regression achieved RMSE = 1.00, MAE = 0.70, and R² = 0.60 across 2,210 valid task–compound pairs; per-endpoint performance was strongest for coagulation proteases (Factor XIIa R² = 0.64; thrombin R² = 0.60). </w:t>
+        <w:t xml:space="preserve"> with a custom ExternalProcess GNN scorer. Pooled test regression achieved RMSE = 1.00 and R² = 0.60 (2,210 pairs); coagulation protease tasks performed best (Factor XIIa R² = 0.64; thrombin R² = 0.60). </w:t>
       </w:r>
       <w:r>
         <w:rPr>
@@ -103,7 +103,7 @@
         <w:t>VKORC1</w:t>
       </w:r>
       <w:r>
-        <w:t xml:space="preserve"> absolute potency prediction remained weak (test R² = −0.38, </w:t>
+        <w:t xml:space="preserve"> prediction remained weak (R² = −0.38, </w:t>
       </w:r>
       <w:r>
         <w:rPr>
@@ -112,43 +112,16 @@
         <w:t>n</w:t>
       </w:r>
       <w:r>
-        <w:t xml:space="preserve"> = 41), with Morgan fingerprint + random forest outperforming the GAT on </w:t>
-      </w:r>
-      <w:r>
-        <w:rPr>
-          <w:i/>
-        </w:rPr>
-        <w:t>VKORC1</w:t>
-      </w:r>
-      <w:r>
-        <w:t xml:space="preserve"> rank correlation (Spearman ρ = 0.55 vs. 0.21). Accordingly, the GNN is deployed in </w:t>
-      </w:r>
-      <w:r>
-        <w:rPr>
-          <w:i/>
-        </w:rPr>
-        <w:t>REINVENT4</w:t>
-      </w:r>
-      <w:r>
-        <w:t xml:space="preserve"> as a </w:t>
+        <w:t xml:space="preserve"> = 41), with Morgan fingerprint + random forest outperforming the GAT on rank correlation (Spearman ρ = 0.55 vs. 0.21). The GNN serves as a </w:t>
       </w:r>
       <w:r>
         <w:rPr>
           <w:b/>
         </w:rPr>
-        <w:t>relative ranker and multi-endpoint selectivity panel</w:t>
-      </w:r>
-      <w:r>
-        <w:t xml:space="preserve">, not as a quantitative potency oracle; flexible docking provides the primary structure-based filter. An illustrative </w:t>
-      </w:r>
-      <w:r>
-        <w:rPr>
-          <w:i/>
-        </w:rPr>
-        <w:t>VKORC1</w:t>
-      </w:r>
-      <w:r>
-        <w:t xml:space="preserve"> case study ranked </w:t>
+        <w:t>relative ranker</w:t>
+      </w:r>
+      <w:r>
+        <w:t xml:space="preserve">, not a potency oracle; flexible docking is the primary structure-based filter. </w:t>
       </w:r>
       <w:r>
         <w:rPr>
@@ -157,97 +130,25 @@
         <w:t>RL_Gen_37</w:t>
       </w:r>
       <w:r>
-        <w:t xml:space="preserve"> highest by </w:t>
+        <w:t xml:space="preserve"> ranked highest by flat-SMILES docking (ΔG = −12.24 kcal/mol); </w:t>
       </w:r>
       <w:r>
         <w:rPr>
           <w:b/>
         </w:rPr>
-        <w:t>flat-SMILES</w:t>
-      </w:r>
-      <w:r>
-        <w:t xml:space="preserve"> flexible docking among generated compounds (ΔG = −12.24 kcal/mol); after explicit stereochemistry assignment, </w:t>
+        <w:t>RL_Gen_37_isoA</w:t>
+      </w:r>
+      <w:r>
+        <w:t xml:space="preserve"> (−10.70 kcal/mol) was used for membrane MD. </w:t>
       </w:r>
       <w:r>
         <w:rPr>
           <w:b/>
         </w:rPr>
-        <w:t>RL_Gen_37_isoA</w:t>
-      </w:r>
-      <w:r>
-        <w:t xml:space="preserve"> (−10.70 kcal/mol) was used for membrane MD parametrization — the flat parent rank is </w:t>
-      </w:r>
-      <w:r>
-        <w:rPr>
-          <w:b/>
-        </w:rPr>
-        <w:t>not</w:t>
-      </w:r>
-      <w:r>
-        <w:t xml:space="preserve"> treated as the final potency estimate. </w:t>
-      </w:r>
-      <w:r>
-        <w:rPr>
-          <w:b/>
-        </w:rPr>
         <w:t>No compounds were synthesized or assayed in vitro.</w:t>
       </w:r>
       <w:r>
-        <w:t xml:space="preserve"> </w:t>
-      </w:r>
-      <w:r>
-        <w:rPr>
-          <w:b/>
-        </w:rPr>
-        <w:t>Comparative explicit-solvent membrane MD</w:t>
-      </w:r>
-      <w:r>
-        <w:t xml:space="preserve"> (</w:t>
-      </w:r>
-      <w:r>
-        <w:rPr>
-          <w:i/>
-        </w:rPr>
-        <w:t>CHARMM</w:t>
-      </w:r>
-      <w:r>
-        <w:t xml:space="preserve">-GUI, CHARMM36m, </w:t>
-      </w:r>
-      <w:r>
-        <w:rPr>
-          <w:i/>
-        </w:rPr>
-        <w:t>GROMACS</w:t>
-      </w:r>
-      <w:r>
-        <w:t xml:space="preserve"> 2024.3) was completed for </w:t>
-      </w:r>
-      <w:r>
-        <w:rPr>
-          <w:b/>
-        </w:rPr>
-        <w:t>RL_Gen_37_isoA</w:t>
-      </w:r>
-      <w:r>
-        <w:t xml:space="preserve"> and </w:t>
-      </w:r>
-      <w:r>
-        <w:rPr>
-          <w:b/>
-        </w:rPr>
-        <w:t>RL_Gen_29_isoA</w:t>
-      </w:r>
-      <w:r>
-        <w:t xml:space="preserve"> (100 ns each) and a </w:t>
-      </w:r>
-      <w:r>
-        <w:rPr>
-          <w:b/>
-        </w:rPr>
-        <w:t>20 ns S-warfarin reference</w:t>
-      </w:r>
-      <w:r>
-        <w:t xml:space="preserve"> pilot. RL_Gen_37_isoA showed stable temperature (310.06 K), second-half mean ligand RMSD of 1.92 Å, and persistent ASN80 H-bond occupancy (99.4%); RL_Gen_29_isoA exhibited elevated ligand RMSD (4.74 Å) and weaker ASN80 contact (10.3%), while the warfarin reference H-bonded primarily via SER81 (62.2%). Code, trained weights, and deposition bundle are openly available.</w:t>
+        <w:t xml:space="preserve"> Comparative membrane MD (100 ns RL_Gen_37_isoA and RL_Gen_29_isoA; 20 ns S-warfarin reference) showed stable RL_Gen_37_isoA (1.92 Å ligand RMSD; 99.4% ASN80 occupancy) versus unstable RL_Gen_29_isoA (4.74 Å; 10.3% ASN80). Code, trained weights, and deposition bundle are openly available.</w:t>
       </w:r>
     </w:p>
     <w:p/>
@@ -303,7 +204,7 @@
         <w:t>VKORC1</w:t>
       </w:r>
       <w:r>
-        <w:t xml:space="preserve">, blocking vitamin K recycling and suppressing γ-carboxylation of clotting factors. Despite decades of clinical use, warfarin's narrow therapeutic index, metabolic variability (notably </w:t>
+        <w:t xml:space="preserve"> [1], blocking vitamin K recycling and suppressing γ-carboxylation of clotting factors. Despite decades of clinical use, warfarin's narrow therapeutic index, metabolic variability (notably </w:t>
       </w:r>
       <w:r>
         <w:rPr>
@@ -336,7 +237,7 @@
         <w:t>VKORC1</w:t>
       </w:r>
       <w:r>
-        <w:t xml:space="preserve"> data are scarce, structure-based docking can supply weak supervision by translating AutoDock Vina binding free energies (ΔG) into approximate potency scales (pXC₅₀), enabling an active-learning cycle in which each docking campaign enriches subsequent model retraining and generative design. Reinforcement-learning agents such as </w:t>
+        <w:t xml:space="preserve"> data are scarce, structure-based docking can supply weak supervision by translating AutoDock Vina [4] binding free energies (ΔG) into approximate potency scales (pXC₅₀), enabling an active-learning cycle in which each docking campaign enriches subsequent model retraining and generative design. Reinforcement-learning agents such as </w:t>
       </w:r>
       <w:r>
         <w:rPr>
@@ -345,7 +246,7 @@
         <w:t>REINVENT4</w:t>
       </w:r>
       <w:r>
-        <w:t xml:space="preserve"> explore chemical space under composite rewards; embedding a project-specific GNN as an external scoring process closes the loop between learned estimates and de novo generation.</w:t>
+        <w:t xml:space="preserve"> [5] explore chemical space under composite rewards; embedding a project-specific GNN as an external scoring process closes the loop between learned estimates and de novo generation.</w:t>
       </w:r>
     </w:p>
     <w:p/>
@@ -369,7 +270,7 @@
         <w:t>multi-task GAT</w:t>
       </w:r>
       <w:r>
-        <w:t xml:space="preserve"> with masked MSE across six coagulation/ADMET endpoints, evaluated under </w:t>
+        <w:t xml:space="preserve"> [3] with masked MSE across six coagulation/ADMET endpoints, evaluated under </w:t>
       </w:r>
       <w:r>
         <w:rPr>
@@ -378,7 +279,7 @@
         <w:t>Murcko scaffold split</w:t>
       </w:r>
       <w:r>
-        <w:t xml:space="preserve"> against Morgan ECFP4 + random forest and a </w:t>
+        <w:t xml:space="preserve"> [2] against Morgan ECFP4 [12] + random forest [11] and a </w:t>
       </w:r>
       <w:r>
         <w:rPr>
@@ -418,10 +319,10 @@
         <w:rPr>
           <w:b/>
         </w:rPr>
-        <w:t>REINVENT4 ExternalProcess</w:t>
-      </w:r>
-      <w:r>
-        <w:t xml:space="preserve"> integration exposing checkpoint predictions to the RL reward function.</w:t>
+        <w:t>REINVENT4</w:t>
+      </w:r>
+      <w:r>
+        <w:t xml:space="preserve"> [5] ExternalProcess integration exposing checkpoint predictions to the RL reward function.</w:t>
       </w:r>
     </w:p>
     <w:p>
@@ -497,7 +398,7 @@
         <w:t>ChEMBL</w:t>
       </w:r>
       <w:r>
-        <w:t xml:space="preserve"> bioactivity with RL-derived Vina pseudo-labels from the active-learning loop (Methods §2.5); benchmark label composition is summarized in Supplementary Table S5.</w:t>
+        <w:t xml:space="preserve"> [6] bioactivity with RL-derived Vina pseudo-labels from the active-learning loop (Methods §2.5); benchmark label composition is summarized in Supplementary Table S5.</w:t>
       </w:r>
     </w:p>
     <w:p/>
@@ -610,7 +511,7 @@
         <w:t>ChEMBL</w:t>
       </w:r>
       <w:r>
-        <w:t xml:space="preserve"> bioactivity and project-specific RL_Gen pseudo-labels (</w:t>
+        <w:t xml:space="preserve"> [6] bioactivity and project-specific RL_Gen pseudo-labels (</w:t>
       </w:r>
       <w:r>
         <w:rPr>
@@ -748,7 +649,7 @@
         <w:t>PyTorch</w:t>
       </w:r>
       <w:r>
-        <w:t xml:space="preserve"> Geometric graph:</w:t>
+        <w:t xml:space="preserve"> Geometric [7] graph:</w:t>
       </w:r>
     </w:p>
     <w:p/>
@@ -772,7 +673,7 @@
         <w:t>RDKit</w:t>
       </w:r>
       <w:r>
-        <w:t xml:space="preserve"> atoms with </w:t>
+        <w:t xml:space="preserve"> [9] atoms with </w:t>
       </w:r>
       <w:r>
         <w:rPr>
@@ -860,7 +761,7 @@
         <w:t>Encoder:</w:t>
       </w:r>
       <w:r>
-        <w:t xml:space="preserve"> Four GAT layers [64 → 128 → 128 → 64], ReLU, dropout </w:t>
+        <w:t xml:space="preserve"> Four GAT [3] layers [64 → 128 → 128 → 64], ReLU, dropout </w:t>
       </w:r>
       <w:r>
         <w:rPr>
@@ -911,7 +812,7 @@
         <w:t>Partition:</w:t>
       </w:r>
       <w:r>
-        <w:t xml:space="preserve"> Bemis–Murcko scaffold split (defined below; underlies Table 1, Figures 1–4).</w:t>
+        <w:t xml:space="preserve"> Bemis–Murcko scaffold split [2] (defined below; underlies Table 1, Figures 1–4).</w:t>
       </w:r>
     </w:p>
     <w:p/>
@@ -980,7 +881,7 @@
         <w:t>REINVENT4</w:t>
       </w:r>
       <w:r>
-        <w:t xml:space="preserve"> scoring (Section 2.6) was saved at the epoch with lowest validation L_MSE (Figure 1).</w:t>
+        <w:t xml:space="preserve"> [5] scoring (Section 2.6) was saved at the epoch with lowest validation L_MSE (Figure 1).</w:t>
       </w:r>
     </w:p>
     <w:p/>
@@ -1043,7 +944,7 @@
     <w:p/>
     <w:p>
       <w:r>
-        <w:t xml:space="preserve">where ȳ is the mean observed label over the evaluated subset. The same definitions were applied to the Morgan FP + random forest baseline. </w:t>
+        <w:t xml:space="preserve">where ȳ is the mean observed label over the evaluated subset. The same definitions were applied to the Morgan FP [12] + random forest [11] baseline. </w:t>
       </w:r>
       <w:r>
         <w:rPr>
@@ -1073,7 +974,7 @@
         <w:t>Scaffold split.</w:t>
       </w:r>
       <w:r>
-        <w:t xml:space="preserve"> To prevent analogue leakage into benchmarks, molecules were grouped by Bemis–Murcko scaffold (stereochemistry stripped). Scaffold groups were sorted by descending size and assigned greedily to train, validation, and test until approximate fractions of 80%, 10%, and 10% of compounds were reached; all members of a scaffold group share the same partition (Figure 3, Table S6). The same partition was used for GAT training, Morgan RF fitting, and all reported test metrics.</w:t>
+        <w:t xml:space="preserve"> To prevent analogue leakage into benchmarks, molecules were grouped by Bemis–Murcko scaffold [2] (stereochemistry stripped). Scaffold groups were sorted by descending size and assigned greedily to train, validation, and test until approximate fractions of 80%, 10%, and 10% of compounds were reached; all members of a scaffold group share the same partition (Figure 3, Table S6). The same partition was used for GAT training, Morgan RF fitting, and all reported test metrics.</w:t>
       </w:r>
     </w:p>
     <w:p/>
@@ -1307,7 +1208,7 @@
         <w:t>Baseline comparators</w:t>
       </w:r>
       <w:r>
-        <w:t xml:space="preserve"> (same scaffold split): (1) Morgan ECFP4 (radius 2, 2048 bits) + per-task random forest (500 trees); (2) </w:t>
+        <w:t xml:space="preserve"> (same scaffold split): (1) Morgan ECFP4 [12] (radius 2, 2048 bits) + per-task random forest [11] (500 trees); (2) </w:t>
       </w:r>
       <w:r>
         <w:rPr>
@@ -1331,7 +1232,7 @@
     <w:p/>
     <w:p>
       <w:r>
-        <w:t>Ligands were prepared from SMILES via conformer enumeration (20 conformers), Meeko protonation/torsion assignment, and PDBQT conversion. Receptors used a flexible PDBQT map with rigid core and flexible side chains at the defined residues. AutoDock Vina: exhaustiveness = 20, energy range = 3.0 kcal/mol, nine binding modes per ligand.</w:t>
+        <w:t>Ligands were prepared from SMILES via conformer enumeration (20 conformers), Meeko [18] protonation/torsion assignment, and PDBQT conversion. Receptors used a flexible PDBQT map with rigid core and flexible side chains at the defined residues. AutoDock Vina [4]: exhaustiveness = 20, energy range = 3.0 kcal/mol, nine binding modes per ligand.</w:t>
       </w:r>
     </w:p>
     <w:p/>
@@ -1529,7 +1430,7 @@
         <w:t>REINVENT4</w:t>
       </w:r>
       <w:r>
-        <w:t xml:space="preserve"> staged learning in which each candidate SMILES receives a composite desirability score from four components: synthetic accessibility (SA), QED, molecular weight (MW), and GNN-predicted </w:t>
+        <w:t xml:space="preserve"> [5] staged learning in which each candidate SMILES receives a composite desirability score from four components: synthetic accessibility (SA) [20], QED [19], molecular weight (MW), and GNN-predicted </w:t>
       </w:r>
       <w:r>
         <w:rPr>
@@ -1619,7 +1520,7 @@
         <w:t>RDKit</w:t>
       </w:r>
       <w:r>
-        <w:t xml:space="preserve"> prior to flexible docking. </w:t>
+        <w:t xml:space="preserve"> [9] prior to flexible docking. </w:t>
       </w:r>
       <w:r>
         <w:rPr>
@@ -1787,7 +1688,7 @@
         <w:t>CHARMM</w:t>
       </w:r>
       <w:r>
-        <w:t xml:space="preserve">-GUI Membrane Builder. Docked ligand coordinates were graph-matched to </w:t>
+        <w:t xml:space="preserve">-GUI [13] Membrane Builder. Docked ligand coordinates were graph-matched to </w:t>
       </w:r>
       <w:r>
         <w:rPr>
@@ -1796,7 +1697,7 @@
         <w:t>CGenFF</w:t>
       </w:r>
       <w:r>
-        <w:t xml:space="preserve">-compatible topology generated via </w:t>
+        <w:t xml:space="preserve">-compatible [16] topology generated via </w:t>
       </w:r>
       <w:r>
         <w:rPr>
@@ -1823,7 +1724,7 @@
         <w:t>ParamChem</w:t>
       </w:r>
       <w:r>
-        <w:t xml:space="preserve"> reparameterization was documented as a fallback if automated parameterization failed (not required for the completed RL systems). Lipids POPC/POPE/POPS/cholesterol (6:2:1:2 per leaflet); 0.15 M NaCl; TIP3P water; CHARMM36m protein/lipid parameters; 310 K; ~134,000 atoms in a 120 Å cubic box. Equilibration used </w:t>
+        <w:t xml:space="preserve"> reparameterization was documented as a fallback if automated parameterization failed (not required for the completed RL systems). Lipids POPC/POPE/POPS/cholesterol (6:2:1:2 per leaflet); 0.15 M NaCl; TIP3P water; CHARMM36m [15] protein/lipid parameters; 310 K; ~134,000 atoms in a 120 Å cubic box. Equilibration used </w:t>
       </w:r>
       <w:r>
         <w:rPr>
@@ -1832,7 +1733,7 @@
         <w:t>CHARMM</w:t>
       </w:r>
       <w:r>
-        <w:t xml:space="preserve">-GUI step6.1–6.6 protocols; production MD used </w:t>
+        <w:t xml:space="preserve">-GUI step6.1–6.6 protocols [14]; production MD used </w:t>
       </w:r>
       <w:r>
         <w:rPr>
@@ -1841,7 +1742,7 @@
         <w:t>GROMACS 2024.3</w:t>
       </w:r>
       <w:r>
-        <w:t xml:space="preserve"> with CUDA (2 fs timestep).</w:t>
+        <w:t xml:space="preserve"> [8] with CUDA (2 fs timestep).</w:t>
       </w:r>
     </w:p>
     <w:p/>
@@ -1901,7 +1802,7 @@
         <w:t>GROMACS</w:t>
       </w:r>
       <w:r>
-        <w:t xml:space="preserve"> analysis tools; production trajectories were generated with </w:t>
+        <w:t xml:space="preserve"> [8] analysis tools; production trajectories were generated with </w:t>
       </w:r>
       <w:r>
         <w:rPr>
@@ -1928,7 +1829,7 @@
         <w:t>no re-simulation</w:t>
       </w:r>
       <w:r>
-        <w:t xml:space="preserve">). Binding-site residue labels follow PLIP/PDB numbering (e.g., ASN80, SER81); </w:t>
+        <w:t xml:space="preserve">). Binding-site residue labels follow PLIP [17]/PDB numbering (e.g., ASN80, SER81); </w:t>
       </w:r>
       <w:r>
         <w:rPr>
@@ -2008,7 +1909,7 @@
         <w:t>ChEMBL</w:t>
       </w:r>
       <w:r>
-        <w:t xml:space="preserve"> labels (Factor XIIa R² = 0.64; thrombin R² = 0.60; Factor Xa R² = 0.56) and modest on </w:t>
+        <w:t xml:space="preserve"> [6] labels (Factor XIIa R² = 0.64; thrombin R² = 0.60; Factor Xa R² = 0.56) and modest on </w:t>
       </w:r>
       <w:r>
         <w:rPr>
@@ -3201,7 +3102,7 @@
           <w:i/>
           <w:sz w:val="20"/>
         </w:rPr>
-        <w:t xml:space="preserve">Figure 4. Morgan ECFP4 + random forest baseline analysis on the Murcko scaffold test set. Three panels report (A) per-task test R², (B) per-task Spearman rank correlation ρ, and (C) </w:t>
+        <w:t xml:space="preserve">Figure 4. Morgan ECFP4 [12] + random forest [11] baseline analysis on the Murcko scaffold test set. Three panels report (A) per-task test R², (B) per-task Spearman rank correlation ρ, and (C) </w:t>
       </w:r>
       <w:r>
         <w:rPr>
@@ -3287,7 +3188,7 @@
         <w:t>not</w:t>
       </w:r>
       <w:r>
-        <w:t xml:space="preserve"> serve as a potency oracle. Morgan RF achieves better </w:t>
+        <w:t xml:space="preserve"> serve as a potency oracle. Morgan RF [11,12] achieves better </w:t>
       </w:r>
       <w:r>
         <w:rPr>
@@ -3350,7 +3251,7 @@
         <w:t>REINVENT4</w:t>
       </w:r>
       <w:r>
-        <w:t xml:space="preserve"> because (i) it outputs all six endpoints in one forward pass for selectivity triage, (ii) Morgan RF lacks the multi-endpoint single-pass inference required for </w:t>
+        <w:t xml:space="preserve"> [5] because (i) it outputs all six endpoints in one forward pass for selectivity triage, (ii) Morgan RF [11,12] lacks the multi-endpoint single-pass inference required for </w:t>
       </w:r>
       <w:r>
         <w:rPr>
@@ -3377,7 +3278,7 @@
         <w:t>VKORC1</w:t>
       </w:r>
       <w:r>
-        <w:t xml:space="preserve"> pseudo-labels from Vina (train partition only after hold-out guards). GNN predictions and Vina-derived pXC₅₀ operate on different scales (Section 3.4).</w:t>
+        <w:t xml:space="preserve"> pseudo-labels from Vina [4] (train partition only after hold-out guards). GNN predictions and Vina-derived pXC₅₀ operate on different scales (Section 3.4).</w:t>
       </w:r>
     </w:p>
     <w:p/>
@@ -3459,7 +3360,7 @@
     <w:p/>
     <w:p>
       <w:r>
-        <w:t xml:space="preserve">Flexible AutoDock Vina screening of the </w:t>
+        <w:t xml:space="preserve">Flexible AutoDock Vina [4] screening of the </w:t>
       </w:r>
       <w:r>
         <w:rPr>
@@ -3468,7 +3369,7 @@
         <w:t>REINVENT4</w:t>
       </w:r>
       <w:r>
-        <w:t xml:space="preserve">-generated RL_Gen library against </w:t>
+        <w:t xml:space="preserve"> [5]-generated RL_Gen library against </w:t>
       </w:r>
       <w:r>
         <w:rPr>
@@ -4205,7 +4106,7 @@
         <w:t>RDKit</w:t>
       </w:r>
       <w:r>
-        <w:t xml:space="preserve">-derived descriptors (MW, LogP, TPSA, QED, Lipinski compliance) were computed for the top-ranked RL_Gen docked poses. Among the six leading RL hits, </w:t>
+        <w:t xml:space="preserve"> [9]-derived descriptors (MW, LogP, TPSA, QED [19], Lipinski compliance) were computed for the top-ranked RL_Gen docked poses. Among the six leading RL hits, </w:t>
       </w:r>
       <w:r>
         <w:rPr>
@@ -6029,7 +5930,7 @@
         <w:t>RL_Gen_37_isoA</w:t>
       </w:r>
       <w:r>
-        <w:t xml:space="preserve"> 3D embed (Section 2.7). H-bond occupancy uses PLIP residue labels mapped to </w:t>
+        <w:t xml:space="preserve"> 3D embed (Section 2.7). H-bond occupancy uses PLIP [17] residue labels mapped to </w:t>
       </w:r>
       <w:r>
         <w:rPr>
@@ -6038,7 +5939,7 @@
         <w:t>GROMACS</w:t>
       </w:r>
       <w:r>
-        <w:t xml:space="preserve"> topology indices per system (Supplementary Table S7).</w:t>
+        <w:t xml:space="preserve"> [8] topology indices per system (Supplementary Table S7).</w:t>
       </w:r>
     </w:p>
     <w:p/>
@@ -6255,7 +6156,7 @@
         <w:t>VKORC1</w:t>
       </w:r>
       <w:r>
-        <w:t xml:space="preserve"> (41 labels) is expected under Murcko split with chirality-blind graphs. Morgan FP + RF achieves superior </w:t>
+        <w:t xml:space="preserve"> (41 labels) is expected under Murcko split [2] with chirality-blind graphs. Morgan FP [12] + RF [11] achieves superior </w:t>
       </w:r>
       <w:r>
         <w:rPr>
@@ -6264,7 +6165,7 @@
         <w:t>VKORC1</w:t>
       </w:r>
       <w:r>
-        <w:t xml:space="preserve"> rank correlation (ρ = 0.55), yet the multi-task GAT provides simultaneous coagulation/ADMET readouts and shares representation with data-rich protease tasks (R² = 0.56–0.64). On the </w:t>
+        <w:t xml:space="preserve"> rank correlation (ρ = 0.55), yet the multi-task GAT [3] provides simultaneous coagulation/ADMET readouts and shares representation with data-rich protease tasks (R² = 0.56–0.64). On the </w:t>
       </w:r>
       <w:r>
         <w:rPr>
@@ -6273,7 +6174,7 @@
         <w:t>ChEMBL</w:t>
       </w:r>
       <w:r>
-        <w:t xml:space="preserve">-only </w:t>
+        <w:t xml:space="preserve">-only [6] </w:t>
       </w:r>
       <w:r>
         <w:rPr>
@@ -6300,7 +6201,7 @@
         <w:t>REINVENT4</w:t>
       </w:r>
       <w:r>
-        <w:t xml:space="preserve"> (weight 2.5×) because it returns all six endpoints in a </w:t>
+        <w:t xml:space="preserve"> [5] (weight 2.5×) because it returns all six endpoints in a </w:t>
       </w:r>
       <w:r>
         <w:rPr>
@@ -6384,7 +6285,7 @@
         <w:t>CHARMM</w:t>
       </w:r>
       <w:r>
-        <w:t>-GUI auto-</w:t>
+        <w:t>-GUI [13,14] auto-</w:t>
       </w:r>
       <w:r>
         <w:rPr>
@@ -6393,7 +6294,7 @@
         <w:t>CGenFF</w:t>
       </w:r>
       <w:r>
-        <w:t xml:space="preserve"> parameters were used because RL_Gen_37 equilibrated and remained stable over 100 ns, although force-field uncertainty for spiro/piperidinone chemotypes remains a limitation.</w:t>
+        <w:t xml:space="preserve"> [16] parameters were used because RL_Gen_37 equilibrated and remained stable over 100 ns, although force-field uncertainty for spiro/piperidinone chemotypes remains a limitation.</w:t>
       </w:r>
     </w:p>
     <w:p/>
@@ -6405,7 +6306,7 @@
         <w:t>Reference enantiomer docking.</w:t>
       </w:r>
       <w:r>
-        <w:t xml:space="preserve"> Supplementary stereoselectivity QC shows that flexible Vina prefers R-warfarin over S-warfarin (ΔΔG = +0.37 kcal/mol) despite the 6WV3 co-crystal containing S-warfarin (SWF). This stereoselectivity inversion is a known limitation of empirical scoring functions and underscores that docking ranks are approximate; reference ligands are retained for protocol QC only and are excluded from the RL case-study tables.</w:t>
+        <w:t xml:space="preserve"> Supplementary stereoselectivity QC shows that flexible Vina [4] prefers R-warfarin over S-warfarin (ΔΔG = +0.37 kcal/mol) despite the 6WV3 co-crystal containing S-warfarin (SWF). This stereoselectivity inversion is a known limitation of empirical scoring functions [10] and underscores that docking ranks are approximate; reference ligands are retained for protocol QC only and are excluded from the RL case-study tables.</w:t>
       </w:r>
     </w:p>
     <w:p/>
@@ -6530,7 +6431,7 @@
     <w:p/>
     <w:p>
       <w:r>
-        <w:t xml:space="preserve">We developed and benchmarked a multi-task GAT-based active-learning </w:t>
+        <w:t xml:space="preserve">We developed and benchmarked a multi-task GAT [3]-based active-learning </w:t>
       </w:r>
       <w:r>
         <w:rPr>
@@ -6548,7 +6449,7 @@
         <w:t>VKORC1</w:t>
       </w:r>
       <w:r>
-        <w:t xml:space="preserve">-directed de novo ligand design, integrating flexible docking, pseudo-label merging, and </w:t>
+        <w:t xml:space="preserve">-directed de novo ligand design, integrating flexible docking [4], pseudo-label merging, and </w:t>
       </w:r>
       <w:r>
         <w:rPr>
@@ -6557,7 +6458,7 @@
         <w:t>REINVENT4</w:t>
       </w:r>
       <w:r>
-        <w:t xml:space="preserve"> generative design with an embedded GNN ranker. Pooled test R² = 0.60 across six endpoints demonstrates meaningful multi-task transfer; </w:t>
+        <w:t xml:space="preserve"> [5] generative design with an embedded GNN ranker. Pooled test R² = 0.60 across six endpoints demonstrates meaningful multi-task transfer; </w:t>
       </w:r>
       <w:r>
         <w:rPr>
@@ -7319,6 +7220,107 @@
       </w:r>
       <w:r>
         <w:t>, 671–690.</w:t>
+      </w:r>
+    </w:p>
+    <w:p>
+      <w:r>
+        <w:t xml:space="preserve">17. Salentin S, Schreiber S, Haupt VJ, Adasme MF, Schroeder M. PLIP: fully automated protein–ligand interaction profiler. </w:t>
+      </w:r>
+      <w:r>
+        <w:rPr>
+          <w:i/>
+        </w:rPr>
+        <w:t>Nucleic Acids Res</w:t>
+      </w:r>
+      <w:r>
+        <w:t xml:space="preserve"> </w:t>
+      </w:r>
+      <w:r>
+        <w:rPr>
+          <w:b/>
+        </w:rPr>
+        <w:t>2015</w:t>
+      </w:r>
+      <w:r>
+        <w:t xml:space="preserve">, </w:t>
+      </w:r>
+      <w:r>
+        <w:rPr>
+          <w:i/>
+        </w:rPr>
+        <w:t>43</w:t>
+      </w:r>
+      <w:r>
+        <w:t>, W443–W447.</w:t>
+      </w:r>
+    </w:p>
+    <w:p>
+      <w:r>
+        <w:t>18. Bell LB, Forli S. Meeko: A Python package for preparing small-molecule ligands for AutoDock. https://github.com/forlilab/meeko (accessed 2025).</w:t>
+      </w:r>
+    </w:p>
+    <w:p>
+      <w:r>
+        <w:t xml:space="preserve">19. Bickerton GR, Paolini GV, Besnard J, Muresan S, Hopkins AL. Quantifying the chemical beauty of drugs. </w:t>
+      </w:r>
+      <w:r>
+        <w:rPr>
+          <w:i/>
+        </w:rPr>
+        <w:t>Nat Chem</w:t>
+      </w:r>
+      <w:r>
+        <w:t xml:space="preserve"> </w:t>
+      </w:r>
+      <w:r>
+        <w:rPr>
+          <w:b/>
+        </w:rPr>
+        <w:t>2012</w:t>
+      </w:r>
+      <w:r>
+        <w:t xml:space="preserve">, </w:t>
+      </w:r>
+      <w:r>
+        <w:rPr>
+          <w:i/>
+        </w:rPr>
+        <w:t>4</w:t>
+      </w:r>
+      <w:r>
+        <w:t>, 90–98.</w:t>
+      </w:r>
+    </w:p>
+    <w:p>
+      <w:r>
+        <w:t xml:space="preserve">20. Ertl P, Schuffenhauer A. Estimation of synthetic accessibility score of drug-like molecules based on molecular complexity and fragment contributions. </w:t>
+      </w:r>
+      <w:r>
+        <w:rPr>
+          <w:i/>
+        </w:rPr>
+        <w:t>J Cheminform</w:t>
+      </w:r>
+      <w:r>
+        <w:t xml:space="preserve"> </w:t>
+      </w:r>
+      <w:r>
+        <w:rPr>
+          <w:b/>
+        </w:rPr>
+        <w:t>2009</w:t>
+      </w:r>
+      <w:r>
+        <w:t xml:space="preserve">, </w:t>
+      </w:r>
+      <w:r>
+        <w:rPr>
+          <w:i/>
+        </w:rPr>
+        <w:t>1</w:t>
+      </w:r>
+      <w:r>
+        <w:t>, 8.</w:t>
       </w:r>
     </w:p>
     <w:p/>

</xml_diff>

<commit_message>
Update Zenodo citation to version 1.0.1 DOI (21209303).
Sync manuscript Data Availability, README, RELEASE, and upload docs
with the published v1.0.1 record; regenerate Word export.

Co-authored-by: Cursor <cursoragent@cursor.com>
</commit_message>
<xml_diff>
--- a/vkorc1_integrated_workflow_manuscript.docx
+++ b/vkorc1_integrated_workflow_manuscript.docx
@@ -6558,10 +6558,10 @@
         <w:rPr>
           <w:b/>
         </w:rPr>
-        <w:t>https://doi.org/10.5281/zenodo.21208445</w:t>
-      </w:r>
-      <w:r>
-        <w:t xml:space="preserve"> (version 1.0). Reference-ligand QC tables (stereoselectivity, docking enrichment, receptor validation) are included in the deposition bundle. The </w:t>
+        <w:t>https://doi.org/10.5281/zenodo.21209303</w:t>
+      </w:r>
+      <w:r>
+        <w:t xml:space="preserve"> (version 1.0.1). All versions: https://doi.org/10.5281/zenodo.21208444. Reference-ligand QC tables (stereoselectivity, docking enrichment, receptor validation) are included in the deposition bundle. The </w:t>
       </w:r>
       <w:r>
         <w:rPr>

</xml_diff>